<commit_message>
Resolve conflitos das propriedades IFC
</commit_message>
<xml_diff>
--- a/atividades/template/Relatorio-Obra.docx
+++ b/atividades/template/Relatorio-Obra.docx
@@ -397,16 +397,8 @@
         <w:rPr>
           <w:bCs/>
         </w:rPr>
-        <w:t>_</w:t>
+        <w:t>_ENTREGA[</w:t>
       </w:r>
-      <w:proofErr w:type="gramStart"/>
-      <w:r>
-        <w:rPr>
-          <w:bCs/>
-        </w:rPr>
-        <w:t>ENTREGA[</w:t>
-      </w:r>
-      <w:proofErr w:type="gramEnd"/>
     </w:p>
     <w:p>
       <w:pPr>
@@ -2070,7 +2062,19 @@
         <w:rPr>
           <w:szCs w:val="24"/>
         </w:rPr>
-        <w:t>[JJJJ]</w:t>
+        <w:t>[</w:t>
+      </w:r>
+      <w:r>
+        <w:rPr>
+          <w:szCs w:val="24"/>
+        </w:rPr>
+        <w:t>MMMM</w:t>
+      </w:r>
+      <w:r>
+        <w:rPr>
+          <w:szCs w:val="24"/>
+        </w:rPr>
+        <w:t>]</w:t>
       </w:r>
     </w:p>
     <w:p>

</xml_diff>